<commit_message>
feat: 咪咕音源全链路打通并内置 / v1.0.16-dev1 / build.ps1 修复
新增 mmusic/search/migu.py（search_all.do + content/listen-url，channel 走请求头；免登录 PQ，HQ/SQ 登录墙自动降级；实测下载字节数与官方声明一致、时长与完整度门禁通过）。内置清单/注册表/Referer 接入 migu，默认顺序 local→kuwo→kugou→migu→aggregator。selftest +5 项咪咕离线测试（234 全过）。build.ps1 改为显式数组传参并检查 PyInstaller 退出码（修复 @splat 对折叠后单元素字符串逐字符展开、及构建失败误报成功）。__version__ → 1.0.16-dev1；DESIGN.md 与 docs 附录 D.3 记录。
</commit_message>
<xml_diff>
--- a/docs/备用资源获取模块-改进方案.docx
+++ b/docs/备用资源获取模块-改进方案.docx
@@ -8419,6 +8419,2014 @@
           <w:sz w:val="19"/>
         </w:rPr>
         <w:t>CC/PD 开放库（已接入维基共享、互联网档案馆）与聚合网关（已接入 NetEase 通道）。</w:t>
+      </w:r>
+    </w:p>
+    <w:p>
+      <w:pPr>
+        <w:spacing w:after="80" w:line="312" w:lineRule="auto"/>
+      </w:pPr>
+      <w:r>
+        <w:rPr>
+          <w:rFonts w:ascii="黑体" w:hAnsi="黑体" w:eastAsia="黑体" w:cs="黑体"/>
+          <w:b/>
+          <w:sz w:val="24"/>
+        </w:rPr>
+        <w:t>D.1 咪咕（Migu）排查进展（2026-10-18 更新）</w:t>
+      </w:r>
+    </w:p>
+    <w:p>
+      <w:pPr>
+        <w:spacing w:after="120" w:line="312" w:lineRule="auto"/>
+      </w:pPr>
+      <w:r>
+        <w:rPr>
+          <w:rFonts w:ascii="微软雅黑" w:hAnsi="微软雅黑" w:eastAsia="微软雅黑" w:cs="微软雅黑"/>
+          <w:b/>
+          <w:sz w:val="21"/>
+        </w:rPr>
+        <w:t>检索侧：已完全打通（可直接用）</w:t>
+      </w:r>
+    </w:p>
+    <w:p>
+      <w:pPr>
+        <w:spacing w:after="0" w:before="0" w:line="252" w:lineRule="auto"/>
+        <w:ind w:left="200"/>
+      </w:pPr>
+      <w:r>
+        <w:rPr>
+          <w:rFonts w:ascii="Consolas" w:hAnsi="Consolas" w:eastAsia="Consolas" w:cs="Consolas"/>
+          <w:b w:val="0"/>
+          <w:color w:val="222222"/>
+          <w:sz w:val="17"/>
+        </w:rPr>
+        <w:t>GET https://app.c.nf.migu.cn/MIGUM2.0/v1.0/content/search_all.do</w:t>
+      </w:r>
+    </w:p>
+    <w:p>
+      <w:pPr>
+        <w:spacing w:after="0" w:before="0" w:line="252" w:lineRule="auto"/>
+        <w:ind w:left="200"/>
+      </w:pPr>
+      <w:r>
+        <w:rPr>
+          <w:rFonts w:ascii="Consolas" w:hAnsi="Consolas" w:eastAsia="Consolas" w:cs="Consolas"/>
+          <w:b w:val="0"/>
+          <w:color w:val="222222"/>
+          <w:sz w:val="17"/>
+        </w:rPr>
+        <w:t xml:space="preserve">    ?text=&lt;关键词&gt;&amp;pageNo=1&amp;pageSize=5&amp;sort=1</w:t>
+      </w:r>
+    </w:p>
+    <w:p>
+      <w:pPr>
+        <w:spacing w:after="0" w:before="0" w:line="252" w:lineRule="auto"/>
+        <w:ind w:left="200"/>
+      </w:pPr>
+      <w:r>
+        <w:rPr>
+          <w:rFonts w:ascii="Consolas" w:hAnsi="Consolas" w:eastAsia="Consolas" w:cs="Consolas"/>
+          <w:b w:val="0"/>
+          <w:color w:val="222222"/>
+          <w:sz w:val="17"/>
+        </w:rPr>
+        <w:t xml:space="preserve">    &amp;searchSwitch={"song":1,"album":0,"singer":0,"tagSong":1,"mvSong":0,"songlist":0,"bestShow":1}</w:t>
+      </w:r>
+    </w:p>
+    <w:p>
+      <w:pPr>
+        <w:spacing w:after="0" w:before="0" w:line="252" w:lineRule="auto"/>
+        <w:ind w:left="200"/>
+      </w:pPr>
+      <w:r>
+        <w:rPr>
+          <w:rFonts w:ascii="Consolas" w:hAnsi="Consolas" w:eastAsia="Consolas" w:cs="Consolas"/>
+          <w:b w:val="0"/>
+          <w:color w:val="222222"/>
+          <w:sz w:val="17"/>
+        </w:rPr>
+        <w:t>→ songResultData.result[] : name / singers[].name / albums[].name</w:t>
+      </w:r>
+    </w:p>
+    <w:p>
+      <w:pPr>
+        <w:spacing w:after="0" w:before="0" w:line="252" w:lineRule="auto"/>
+        <w:ind w:left="200"/>
+      </w:pPr>
+      <w:r>
+        <w:rPr>
+          <w:rFonts w:ascii="Consolas" w:hAnsi="Consolas" w:eastAsia="Consolas" w:cs="Consolas"/>
+          <w:b w:val="0"/>
+          <w:color w:val="222222"/>
+          <w:sz w:val="17"/>
+        </w:rPr>
+        <w:t xml:space="preserve">                            / contentId / copyrightId / id / imgItems[].img</w:t>
+      </w:r>
+    </w:p>
+    <w:p>
+      <w:pPr>
+        <w:spacing w:after="120" w:line="312" w:lineRule="auto"/>
+      </w:pPr>
+      <w:r>
+        <w:rPr>
+          <w:rFonts w:ascii="微软雅黑" w:hAnsi="微软雅黑" w:eastAsia="微软雅黑" w:cs="微软雅黑"/>
+          <w:b w:val="0"/>
+          <w:sz w:val="21"/>
+        </w:rPr>
+        <w:t>实测「稻香」返回 72 条，字段齐全（</w:t>
+      </w:r>
+      <w:r>
+        <w:rPr>
+          <w:rFonts w:ascii="Consolas" w:hAnsi="Consolas" w:eastAsia="Consolas" w:cs="Consolas"/>
+          <w:b w:val="0"/>
+          <w:color w:val="B03030"/>
+          <w:sz w:val="19"/>
+        </w:rPr>
+        <w:t>searchSwitch</w:t>
+      </w:r>
+      <w:r>
+        <w:rPr>
+          <w:rFonts w:ascii="微软雅黑" w:hAnsi="微软雅黑" w:eastAsia="微软雅黑" w:cs="微软雅黑"/>
+          <w:b w:val="0"/>
+          <w:sz w:val="21"/>
+        </w:rPr>
+        <w:t xml:space="preserve"> 是必需的，不带它只会返回空的信封）。</w:t>
+      </w:r>
+    </w:p>
+    <w:p>
+      <w:pPr>
+        <w:spacing w:after="120" w:line="312" w:lineRule="auto"/>
+      </w:pPr>
+      <w:r>
+        <w:rPr>
+          <w:rFonts w:ascii="微软雅黑" w:hAnsi="微软雅黑" w:eastAsia="微软雅黑" w:cs="微软雅黑"/>
+          <w:b/>
+          <w:sz w:val="21"/>
+        </w:rPr>
+        <w:t>播放侧：接口已变更，暂未打通</w:t>
+      </w:r>
+    </w:p>
+    <w:p>
+      <w:pPr>
+        <w:spacing w:after="40" w:line="312" w:lineRule="auto"/>
+        <w:ind w:left="320"/>
+      </w:pPr>
+      <w:r>
+        <w:rPr>
+          <w:rFonts w:ascii="微软雅黑" w:hAnsi="微软雅黑" w:eastAsia="微软雅黑" w:cs="微软雅黑"/>
+          <w:b w:val="0"/>
+          <w:sz w:val="21"/>
+        </w:rPr>
+        <w:t xml:space="preserve">• </w:t>
+      </w:r>
+      <w:r>
+        <w:rPr>
+          <w:rFonts w:ascii="Consolas" w:hAnsi="Consolas" w:eastAsia="Consolas" w:cs="Consolas"/>
+          <w:b w:val="0"/>
+          <w:color w:val="B03030"/>
+          <w:sz w:val="19"/>
+        </w:rPr>
+        <w:t>content/sub/listenSong.do</w:t>
+      </w:r>
+      <w:r>
+        <w:rPr>
+          <w:rFonts w:ascii="微软雅黑" w:hAnsi="微软雅黑" w:eastAsia="微软雅黑" w:cs="微软雅黑"/>
+          <w:b w:val="0"/>
+          <w:sz w:val="21"/>
+        </w:rPr>
+        <w:t xml:space="preserve">（MIGUM2.0 / MIGUM3.0 都试过）恒定返回 </w:t>
+      </w:r>
+      <w:r>
+        <w:rPr>
+          <w:rFonts w:ascii="Consolas" w:hAnsi="Consolas" w:eastAsia="Consolas" w:cs="Consolas"/>
+          <w:b w:val="0"/>
+          <w:color w:val="B03030"/>
+          <w:sz w:val="19"/>
+        </w:rPr>
+        <w:t>{"code":"200002","info":"PE参数格式错误"}</w:t>
+      </w:r>
+      <w:r>
+        <w:rPr>
+          <w:rFonts w:ascii="微软雅黑" w:hAnsi="微软雅黑" w:eastAsia="微软雅黑" w:cs="微软雅黑"/>
+          <w:b w:val="0"/>
+          <w:sz w:val="21"/>
+        </w:rPr>
+        <w:t>。</w:t>
+      </w:r>
+    </w:p>
+    <w:p>
+      <w:pPr>
+        <w:spacing w:after="40" w:line="312" w:lineRule="auto"/>
+        <w:ind w:left="320"/>
+      </w:pPr>
+      <w:r>
+        <w:rPr>
+          <w:rFonts w:ascii="微软雅黑" w:hAnsi="微软雅黑" w:eastAsia="微软雅黑" w:cs="微软雅黑"/>
+          <w:b w:val="0"/>
+          <w:sz w:val="21"/>
+        </w:rPr>
+        <w:t xml:space="preserve">• 已排除"参数值写错"：换 </w:t>
+      </w:r>
+      <w:r>
+        <w:rPr>
+          <w:rFonts w:ascii="Consolas" w:hAnsi="Consolas" w:eastAsia="Consolas" w:cs="Consolas"/>
+          <w:b w:val="0"/>
+          <w:color w:val="B03030"/>
+          <w:sz w:val="19"/>
+        </w:rPr>
+        <w:t>toneFlag</w:t>
+      </w:r>
+      <w:r>
+        <w:rPr>
+          <w:rFonts w:ascii="微软雅黑" w:hAnsi="微软雅黑" w:eastAsia="微软雅黑" w:cs="微软雅黑"/>
+          <w:b w:val="0"/>
+          <w:sz w:val="21"/>
+        </w:rPr>
+        <w:t xml:space="preserve">（HQ/LQ）、换 </w:t>
+      </w:r>
+      <w:r>
+        <w:rPr>
+          <w:rFonts w:ascii="Consolas" w:hAnsi="Consolas" w:eastAsia="Consolas" w:cs="Consolas"/>
+          <w:b w:val="0"/>
+          <w:color w:val="B03030"/>
+          <w:sz w:val="19"/>
+        </w:rPr>
+        <w:t>version</w:t>
+      </w:r>
+      <w:r>
+        <w:rPr>
+          <w:rFonts w:ascii="微软雅黑" w:hAnsi="微软雅黑" w:eastAsia="微软雅黑" w:cs="微软雅黑"/>
+          <w:b w:val="0"/>
+          <w:sz w:val="21"/>
+        </w:rPr>
+        <w:t>（5.1/6.0/6.0.0）、</w:t>
+      </w:r>
+    </w:p>
+    <w:p>
+      <w:pPr>
+        <w:spacing w:after="120" w:line="312" w:lineRule="auto"/>
+      </w:pPr>
+      <w:r>
+        <w:rPr>
+          <w:rFonts w:ascii="微软雅黑" w:hAnsi="微软雅黑" w:eastAsia="微软雅黑" w:cs="微软雅黑"/>
+          <w:b w:val="0"/>
+          <w:sz w:val="21"/>
+        </w:rPr>
+        <w:t xml:space="preserve">  </w:t>
+      </w:r>
+      <w:r>
+        <w:rPr>
+          <w:rFonts w:ascii="微软雅黑" w:hAnsi="微软雅黑" w:eastAsia="微软雅黑" w:cs="微软雅黑"/>
+          <w:b/>
+          <w:sz w:val="21"/>
+        </w:rPr>
+        <w:t>去掉 `userId`</w:t>
+      </w:r>
+      <w:r>
+        <w:rPr>
+          <w:rFonts w:ascii="微软雅黑" w:hAnsi="微软雅黑" w:eastAsia="微软雅黑" w:cs="微软雅黑"/>
+          <w:b w:val="0"/>
+          <w:sz w:val="21"/>
+        </w:rPr>
+        <w:t xml:space="preserve">、换 </w:t>
+      </w:r>
+      <w:r>
+        <w:rPr>
+          <w:rFonts w:ascii="Consolas" w:hAnsi="Consolas" w:eastAsia="Consolas" w:cs="Consolas"/>
+          <w:b w:val="0"/>
+          <w:color w:val="B03030"/>
+          <w:sz w:val="19"/>
+        </w:rPr>
+        <w:t>copyrightId/contentId</w:t>
+      </w:r>
+      <w:r>
+        <w:rPr>
+          <w:rFonts w:ascii="微软雅黑" w:hAnsi="微软雅黑" w:eastAsia="微软雅黑" w:cs="微软雅黑"/>
+          <w:b w:val="0"/>
+          <w:sz w:val="21"/>
+        </w:rPr>
+        <w:t xml:space="preserve"> 组合 —— </w:t>
+      </w:r>
+      <w:r>
+        <w:rPr>
+          <w:rFonts w:ascii="微软雅黑" w:hAnsi="微软雅黑" w:eastAsia="微软雅黑" w:cs="微软雅黑"/>
+          <w:b/>
+          <w:sz w:val="21"/>
+        </w:rPr>
+        <w:t>六种变体返回完全相同的错误</w:t>
+      </w:r>
+      <w:r>
+        <w:rPr>
+          <w:rFonts w:ascii="微软雅黑" w:hAnsi="微软雅黑" w:eastAsia="微软雅黑" w:cs="微软雅黑"/>
+          <w:b w:val="0"/>
+          <w:sz w:val="21"/>
+        </w:rPr>
+        <w:t>。</w:t>
+      </w:r>
+    </w:p>
+    <w:p>
+      <w:pPr>
+        <w:spacing w:after="120" w:line="312" w:lineRule="auto"/>
+      </w:pPr>
+      <w:r>
+        <w:rPr>
+          <w:rFonts w:ascii="微软雅黑" w:hAnsi="微软雅黑" w:eastAsia="微软雅黑" w:cs="微软雅黑"/>
+          <w:b w:val="0"/>
+          <w:sz w:val="21"/>
+        </w:rPr>
+        <w:t xml:space="preserve">  说明缺的是</w:t>
+      </w:r>
+      <w:r>
+        <w:rPr>
+          <w:rFonts w:ascii="微软雅黑" w:hAnsi="微软雅黑" w:eastAsia="微软雅黑" w:cs="微软雅黑"/>
+          <w:b/>
+          <w:sz w:val="21"/>
+        </w:rPr>
+        <w:t>一个必填项（很可能就是 `pe`，即播放参数签名）</w:t>
+      </w:r>
+      <w:r>
+        <w:rPr>
+          <w:rFonts w:ascii="微软雅黑" w:hAnsi="微软雅黑" w:eastAsia="微软雅黑" w:cs="微软雅黑"/>
+          <w:b w:val="0"/>
+          <w:sz w:val="21"/>
+        </w:rPr>
+        <w:t>，而不是取值不对。</w:t>
+      </w:r>
+    </w:p>
+    <w:p>
+      <w:pPr>
+        <w:spacing w:after="40" w:line="312" w:lineRule="auto"/>
+        <w:ind w:left="320"/>
+      </w:pPr>
+      <w:r>
+        <w:rPr>
+          <w:rFonts w:ascii="微软雅黑" w:hAnsi="微软雅黑" w:eastAsia="微软雅黑" w:cs="微软雅黑"/>
+          <w:b w:val="0"/>
+          <w:sz w:val="21"/>
+        </w:rPr>
+        <w:t>• 网页端：</w:t>
+      </w:r>
+      <w:r>
+        <w:rPr>
+          <w:rFonts w:ascii="Consolas" w:hAnsi="Consolas" w:eastAsia="Consolas" w:cs="Consolas"/>
+          <w:b w:val="0"/>
+          <w:color w:val="B03030"/>
+          <w:sz w:val="19"/>
+        </w:rPr>
+        <w:t>music.migu.cn</w:t>
+      </w:r>
+      <w:r>
+        <w:rPr>
+          <w:rFonts w:ascii="微软雅黑" w:hAnsi="微软雅黑" w:eastAsia="微软雅黑" w:cs="微软雅黑"/>
+          <w:b w:val="0"/>
+          <w:sz w:val="21"/>
+        </w:rPr>
+        <w:t xml:space="preserve"> 是懒加载 SPA，主 JS 仅 2 KB（真实接口在分块里），</w:t>
+      </w:r>
+    </w:p>
+    <w:p>
+      <w:pPr>
+        <w:spacing w:after="120" w:line="312" w:lineRule="auto"/>
+      </w:pPr>
+      <w:r>
+        <w:rPr>
+          <w:rFonts w:ascii="微软雅黑" w:hAnsi="微软雅黑" w:eastAsia="微软雅黑" w:cs="微软雅黑"/>
+          <w:b w:val="0"/>
+          <w:sz w:val="21"/>
+        </w:rPr>
+        <w:t xml:space="preserve">  直接抓 DOM 拿 </w:t>
+      </w:r>
+      <w:r>
+        <w:rPr>
+          <w:rFonts w:ascii="Consolas" w:hAnsi="Consolas" w:eastAsia="Consolas" w:cs="Consolas"/>
+          <w:b w:val="0"/>
+          <w:color w:val="B03030"/>
+          <w:sz w:val="19"/>
+        </w:rPr>
+        <w:t>&lt;audio src&gt;</w:t>
+      </w:r>
+      <w:r>
+        <w:rPr>
+          <w:rFonts w:ascii="微软雅黑" w:hAnsi="微软雅黑" w:eastAsia="微软雅黑" w:cs="微软雅黑"/>
+          <w:b w:val="0"/>
+          <w:sz w:val="21"/>
+        </w:rPr>
+        <w:t xml:space="preserve"> 不可行；且该站 JS 由</w:t>
+      </w:r>
+      <w:r>
+        <w:rPr>
+          <w:rFonts w:ascii="微软雅黑" w:hAnsi="微软雅黑" w:eastAsia="微软雅黑" w:cs="微软雅黑"/>
+          <w:b/>
+          <w:sz w:val="21"/>
+        </w:rPr>
+        <w:t>证书不受严格 X509 校验</w:t>
+      </w:r>
+      <w:r>
+        <w:rPr>
+          <w:rFonts w:ascii="微软雅黑" w:hAnsi="微软雅黑" w:eastAsia="微软雅黑" w:cs="微软雅黑"/>
+          <w:b w:val="0"/>
+          <w:sz w:val="21"/>
+        </w:rPr>
+        <w:t>的节点提供</w:t>
+      </w:r>
+    </w:p>
+    <w:p>
+      <w:pPr>
+        <w:spacing w:after="120" w:line="312" w:lineRule="auto"/>
+      </w:pPr>
+      <w:r>
+        <w:rPr>
+          <w:rFonts w:ascii="微软雅黑" w:hAnsi="微软雅黑" w:eastAsia="微软雅黑" w:cs="微软雅黑"/>
+          <w:b w:val="0"/>
+          <w:sz w:val="21"/>
+        </w:rPr>
+        <w:t xml:space="preserve">  （普通 urllib 会 </w:t>
+      </w:r>
+      <w:r>
+        <w:rPr>
+          <w:rFonts w:ascii="Consolas" w:hAnsi="Consolas" w:eastAsia="Consolas" w:cs="Consolas"/>
+          <w:b w:val="0"/>
+          <w:color w:val="B03030"/>
+          <w:sz w:val="19"/>
+        </w:rPr>
+        <w:t>CERTIFICATE_VERIFY_FAILED</w:t>
+      </w:r>
+      <w:r>
+        <w:rPr>
+          <w:rFonts w:ascii="微软雅黑" w:hAnsi="微软雅黑" w:eastAsia="微软雅黑" w:cs="微软雅黑"/>
+          <w:b w:val="0"/>
+          <w:sz w:val="21"/>
+        </w:rPr>
+        <w:t xml:space="preserve">，需用本项目的 </w:t>
+      </w:r>
+      <w:r>
+        <w:rPr>
+          <w:rFonts w:ascii="Consolas" w:hAnsi="Consolas" w:eastAsia="Consolas" w:cs="Consolas"/>
+          <w:b w:val="0"/>
+          <w:color w:val="B03030"/>
+          <w:sz w:val="19"/>
+        </w:rPr>
+        <w:t>HttpClient</w:t>
+      </w:r>
+      <w:r>
+        <w:rPr>
+          <w:rFonts w:ascii="微软雅黑" w:hAnsi="微软雅黑" w:eastAsia="微软雅黑" w:cs="微软雅黑"/>
+          <w:b w:val="0"/>
+          <w:sz w:val="21"/>
+        </w:rPr>
+        <w:t xml:space="preserve"> 才能读到）。</w:t>
+      </w:r>
+    </w:p>
+    <w:p>
+      <w:pPr>
+        <w:spacing w:after="120" w:line="312" w:lineRule="auto"/>
+      </w:pPr>
+      <w:r>
+        <w:rPr>
+          <w:rFonts w:ascii="微软雅黑" w:hAnsi="微软雅黑" w:eastAsia="微软雅黑" w:cs="微软雅黑"/>
+          <w:b/>
+          <w:sz w:val="21"/>
+        </w:rPr>
+        <w:t>下一步（按性价比排序）</w:t>
+      </w:r>
+    </w:p>
+    <w:p>
+      <w:pPr>
+        <w:spacing w:after="40" w:line="312" w:lineRule="auto"/>
+        <w:ind w:left="320"/>
+      </w:pPr>
+      <w:r>
+        <w:rPr>
+          <w:rFonts w:ascii="微软雅黑" w:hAnsi="微软雅黑" w:eastAsia="微软雅黑" w:cs="微软雅黑"/>
+          <w:b w:val="0"/>
+          <w:sz w:val="21"/>
+        </w:rPr>
+        <w:t>1. 在浏览器里打开咪咕 H5 播放页，</w:t>
+      </w:r>
+      <w:r>
+        <w:rPr>
+          <w:rFonts w:ascii="微软雅黑" w:hAnsi="微软雅黑" w:eastAsia="微软雅黑" w:cs="微软雅黑"/>
+          <w:b/>
+          <w:sz w:val="21"/>
+        </w:rPr>
+        <w:t>抓它实际发出的请求</w:t>
+      </w:r>
+      <w:r>
+        <w:rPr>
+          <w:rFonts w:ascii="微软雅黑" w:hAnsi="微软雅黑" w:eastAsia="微软雅黑" w:cs="微软雅黑"/>
+          <w:b w:val="0"/>
+          <w:sz w:val="21"/>
+        </w:rPr>
+        <w:t xml:space="preserve">（含 </w:t>
+      </w:r>
+      <w:r>
+        <w:rPr>
+          <w:rFonts w:ascii="Consolas" w:hAnsi="Consolas" w:eastAsia="Consolas" w:cs="Consolas"/>
+          <w:b w:val="0"/>
+          <w:color w:val="B03030"/>
+          <w:sz w:val="19"/>
+        </w:rPr>
+        <w:t>pe</w:t>
+      </w:r>
+      <w:r>
+        <w:rPr>
+          <w:rFonts w:ascii="微软雅黑" w:hAnsi="微软雅黑" w:eastAsia="微软雅黑" w:cs="微软雅黑"/>
+          <w:b w:val="0"/>
+          <w:sz w:val="21"/>
+        </w:rPr>
+        <w:t>/签名参数），据实复刻 —— 这是唯一可靠路径；</w:t>
+      </w:r>
+    </w:p>
+    <w:p>
+      <w:pPr>
+        <w:spacing w:after="40" w:line="312" w:lineRule="auto"/>
+        <w:ind w:left="320"/>
+      </w:pPr>
+      <w:r>
+        <w:rPr>
+          <w:rFonts w:ascii="微软雅黑" w:hAnsi="微软雅黑" w:eastAsia="微软雅黑" w:cs="微软雅黑"/>
+          <w:b w:val="0"/>
+          <w:sz w:val="21"/>
+        </w:rPr>
+        <w:t xml:space="preserve">2. 或检索分块 JS 里 </w:t>
+      </w:r>
+      <w:r>
+        <w:rPr>
+          <w:rFonts w:ascii="Consolas" w:hAnsi="Consolas" w:eastAsia="Consolas" w:cs="Consolas"/>
+          <w:b w:val="0"/>
+          <w:color w:val="B03030"/>
+          <w:sz w:val="19"/>
+        </w:rPr>
+        <w:t>listenSong</w:t>
+      </w:r>
+      <w:r>
+        <w:rPr>
+          <w:rFonts w:ascii="微软雅黑" w:hAnsi="微软雅黑" w:eastAsia="微软雅黑" w:cs="微软雅黑"/>
+          <w:b w:val="0"/>
+          <w:sz w:val="21"/>
+        </w:rPr>
+        <w:t xml:space="preserve"> / </w:t>
+      </w:r>
+      <w:r>
+        <w:rPr>
+          <w:rFonts w:ascii="Consolas" w:hAnsi="Consolas" w:eastAsia="Consolas" w:cs="Consolas"/>
+          <w:b w:val="0"/>
+          <w:color w:val="B03030"/>
+          <w:sz w:val="19"/>
+        </w:rPr>
+        <w:t>playUrl</w:t>
+      </w:r>
+      <w:r>
+        <w:rPr>
+          <w:rFonts w:ascii="微软雅黑" w:hAnsi="微软雅黑" w:eastAsia="微软雅黑" w:cs="微软雅黑"/>
+          <w:b w:val="0"/>
+          <w:sz w:val="21"/>
+        </w:rPr>
+        <w:t xml:space="preserve"> 附近的参数拼装代码；</w:t>
+      </w:r>
+    </w:p>
+    <w:p>
+      <w:pPr>
+        <w:spacing w:after="40" w:line="312" w:lineRule="auto"/>
+        <w:ind w:left="320"/>
+      </w:pPr>
+      <w:r>
+        <w:rPr>
+          <w:rFonts w:ascii="微软雅黑" w:hAnsi="微软雅黑" w:eastAsia="微软雅黑" w:cs="微软雅黑"/>
+          <w:b w:val="0"/>
+          <w:sz w:val="21"/>
+        </w:rPr>
+        <w:t>3. 打通并实测「检索 → 直链 → 下载 → 校验」全链路后，才按"能交付才内置"加入清单。</w:t>
+      </w:r>
+    </w:p>
+    <w:p>
+      <w:pPr>
+        <w:spacing w:after="80" w:line="312" w:lineRule="auto"/>
+      </w:pPr>
+      <w:r>
+        <w:rPr>
+          <w:rFonts w:ascii="黑体" w:hAnsi="黑体" w:eastAsia="黑体" w:cs="黑体"/>
+          <w:b/>
+          <w:sz w:val="24"/>
+        </w:rPr>
+        <w:t>D.2 咪咕播放侧关键突破（2026-10-18 抓包实测）</w:t>
+      </w:r>
+    </w:p>
+    <w:p>
+      <w:pPr>
+        <w:spacing w:after="120" w:line="312" w:lineRule="auto"/>
+      </w:pPr>
+      <w:r>
+        <w:rPr>
+          <w:rFonts w:ascii="微软雅黑" w:hAnsi="微软雅黑" w:eastAsia="微软雅黑" w:cs="微软雅黑"/>
+          <w:b/>
+          <w:sz w:val="21"/>
+        </w:rPr>
+        <w:t>① 咪咕 CDN 不校验签名 —— 参数全是装饰（已证实）</w:t>
+      </w:r>
+    </w:p>
+    <w:p>
+      <w:pPr>
+        <w:spacing w:after="120" w:line="312" w:lineRule="auto"/>
+      </w:pPr>
+      <w:r>
+        <w:rPr>
+          <w:rFonts w:ascii="微软雅黑" w:hAnsi="微软雅黑" w:eastAsia="微软雅黑" w:cs="微软雅黑"/>
+          <w:b w:val="0"/>
+          <w:sz w:val="21"/>
+        </w:rPr>
+        <w:t>用户抓到一条真实播放直链（</w:t>
+      </w:r>
+      <w:r>
+        <w:rPr>
+          <w:rFonts w:ascii="Consolas" w:hAnsi="Consolas" w:eastAsia="Consolas" w:cs="Consolas"/>
+          <w:b w:val="0"/>
+          <w:color w:val="B03030"/>
+          <w:sz w:val="19"/>
+        </w:rPr>
+        <w:t>freetyst.nf.migu.cn/public/product9th/product47/.../MP3_128_16_Stero/69085303837164806.mp3?Key=...&amp;Tim=...&amp;playSessionId=...</w:t>
+      </w:r>
+      <w:r>
+        <w:rPr>
+          <w:rFonts w:ascii="微软雅黑" w:hAnsi="微软雅黑" w:eastAsia="微软雅黑" w:cs="微软雅黑"/>
+          <w:b w:val="0"/>
+          <w:sz w:val="21"/>
+        </w:rPr>
+        <w:t>）。</w:t>
+      </w:r>
+    </w:p>
+    <w:p>
+      <w:pPr>
+        <w:spacing w:after="120" w:line="312" w:lineRule="auto"/>
+      </w:pPr>
+      <w:r>
+        <w:rPr>
+          <w:rFonts w:ascii="微软雅黑" w:hAnsi="微软雅黑" w:eastAsia="微软雅黑" w:cs="微软雅黑"/>
+          <w:b w:val="0"/>
+          <w:sz w:val="21"/>
+        </w:rPr>
+        <w:t>逐项删除参数实测：</w:t>
+      </w:r>
+    </w:p>
+    <w:tbl>
+      <w:tblPr>
+        <w:tblStyle w:val="TableGrid"/>
+        <w:tblW w:type="auto" w:w="0"/>
+        <w:jc w:val="center"/>
+        <w:tblLook w:firstColumn="1" w:firstRow="1" w:lastColumn="0" w:lastRow="0" w:noHBand="0" w:noVBand="1" w:val="04A0"/>
+      </w:tblPr>
+      <w:tblGrid>
+        <w:gridCol w:w="4320"/>
+        <w:gridCol w:w="4320"/>
+      </w:tblGrid>
+      <w:tr>
+        <w:tc>
+          <w:tcPr>
+            <w:tcW w:type="dxa" w:w="4320"/>
+          </w:tcPr>
+          <w:p>
+            <w:pPr>
+              <w:spacing w:after="40"/>
+            </w:pPr>
+            <w:r>
+              <w:rPr>
+                <w:rFonts w:ascii="微软雅黑" w:hAnsi="微软雅黑" w:eastAsia="微软雅黑" w:cs="微软雅黑"/>
+                <w:b/>
+                <w:sz w:val="19"/>
+              </w:rPr>
+              <w:t>变体</w:t>
+            </w:r>
+          </w:p>
+        </w:tc>
+        <w:tc>
+          <w:tcPr>
+            <w:tcW w:type="dxa" w:w="4320"/>
+          </w:tcPr>
+          <w:p>
+            <w:pPr>
+              <w:spacing w:after="40"/>
+            </w:pPr>
+            <w:r>
+              <w:rPr>
+                <w:rFonts w:ascii="微软雅黑" w:hAnsi="微软雅黑" w:eastAsia="微软雅黑" w:cs="微软雅黑"/>
+                <w:b/>
+                <w:sz w:val="19"/>
+              </w:rPr>
+              <w:t>结果</w:t>
+            </w:r>
+          </w:p>
+        </w:tc>
+      </w:tr>
+      <w:tr>
+        <w:tc>
+          <w:tcPr>
+            <w:tcW w:type="dxa" w:w="4320"/>
+          </w:tcPr>
+          <w:p>
+            <w:pPr>
+              <w:spacing w:after="40"/>
+            </w:pPr>
+            <w:r>
+              <w:rPr>
+                <w:rFonts w:ascii="微软雅黑" w:hAnsi="微软雅黑" w:eastAsia="微软雅黑" w:cs="微软雅黑"/>
+                <w:b w:val="0"/>
+                <w:sz w:val="19"/>
+              </w:rPr>
+              <w:t>原样（全参数）</w:t>
+            </w:r>
+          </w:p>
+        </w:tc>
+        <w:tc>
+          <w:tcPr>
+            <w:tcW w:type="dxa" w:w="4320"/>
+          </w:tcPr>
+          <w:p>
+            <w:pPr>
+              <w:spacing w:after="40"/>
+            </w:pPr>
+            <w:r>
+              <w:rPr>
+                <w:rFonts w:ascii="微软雅黑" w:hAnsi="微软雅黑" w:eastAsia="微软雅黑" w:cs="微软雅黑"/>
+                <w:b w:val="0"/>
+                <w:sz w:val="19"/>
+              </w:rPr>
+              <w:t>3681 KB / 128kbps / 3:56</w:t>
+            </w:r>
+          </w:p>
+        </w:tc>
+      </w:tr>
+      <w:tr>
+        <w:tc>
+          <w:tcPr>
+            <w:tcW w:type="dxa" w:w="4320"/>
+          </w:tcPr>
+          <w:p>
+            <w:pPr>
+              <w:spacing w:after="40"/>
+            </w:pPr>
+            <w:r>
+              <w:rPr>
+                <w:rFonts w:ascii="微软雅黑" w:hAnsi="微软雅黑" w:eastAsia="微软雅黑" w:cs="微软雅黑"/>
+                <w:b/>
+                <w:sz w:val="19"/>
+              </w:rPr>
+              <w:t>删掉全部查询串</w:t>
+            </w:r>
+          </w:p>
+        </w:tc>
+        <w:tc>
+          <w:tcPr>
+            <w:tcW w:type="dxa" w:w="4320"/>
+          </w:tcPr>
+          <w:p>
+            <w:pPr>
+              <w:spacing w:after="40"/>
+            </w:pPr>
+            <w:r>
+              <w:rPr>
+                <w:rFonts w:ascii="微软雅黑" w:hAnsi="微软雅黑" w:eastAsia="微软雅黑" w:cs="微软雅黑"/>
+                <w:b/>
+                <w:sz w:val="19"/>
+              </w:rPr>
+              <w:t>3681 KB / 3:56（完全一样）</w:t>
+            </w:r>
+          </w:p>
+        </w:tc>
+      </w:tr>
+      <w:tr>
+        <w:tc>
+          <w:tcPr>
+            <w:tcW w:type="dxa" w:w="4320"/>
+          </w:tcPr>
+          <w:p>
+            <w:pPr>
+              <w:spacing w:after="40"/>
+            </w:pPr>
+            <w:r>
+              <w:rPr>
+                <w:rFonts w:ascii="微软雅黑" w:hAnsi="微软雅黑" w:eastAsia="微软雅黑" w:cs="微软雅黑"/>
+                <w:b w:val="0"/>
+                <w:sz w:val="19"/>
+              </w:rPr>
+              <w:t>只留 Key / Tim / Key+Tim / playSessionId / msisdn / resourceId</w:t>
+            </w:r>
+          </w:p>
+        </w:tc>
+        <w:tc>
+          <w:tcPr>
+            <w:tcW w:type="dxa" w:w="4320"/>
+          </w:tcPr>
+          <w:p>
+            <w:pPr>
+              <w:spacing w:after="40"/>
+            </w:pPr>
+            <w:r>
+              <w:rPr>
+                <w:rFonts w:ascii="微软雅黑" w:hAnsi="微软雅黑" w:eastAsia="微软雅黑" w:cs="微软雅黑"/>
+                <w:b w:val="0"/>
+                <w:sz w:val="19"/>
+              </w:rPr>
+              <w:t>全部一样</w:t>
+            </w:r>
+          </w:p>
+        </w:tc>
+      </w:tr>
+    </w:tbl>
+    <w:p>
+      <w:pPr>
+        <w:spacing w:after="80"/>
+      </w:pPr>
+    </w:p>
+    <w:p>
+      <w:pPr>
+        <w:spacing w:after="120" w:line="312" w:lineRule="auto"/>
+      </w:pPr>
+      <w:r>
+        <w:rPr>
+          <w:rFonts w:ascii="微软雅黑" w:hAnsi="微软雅黑" w:eastAsia="微软雅黑" w:cs="微软雅黑"/>
+          <w:b w:val="0"/>
+          <w:sz w:val="21"/>
+        </w:rPr>
+        <w:t xml:space="preserve">→ 与夸克那条 </w:t>
+      </w:r>
+      <w:r>
+        <w:rPr>
+          <w:rFonts w:ascii="Consolas" w:hAnsi="Consolas" w:eastAsia="Consolas" w:cs="Consolas"/>
+          <w:b w:val="0"/>
+          <w:color w:val="B03030"/>
+          <w:sz w:val="19"/>
+        </w:rPr>
+        <w:t>from=vip</w:t>
+      </w:r>
+      <w:r>
+        <w:rPr>
+          <w:rFonts w:ascii="微软雅黑" w:hAnsi="微软雅黑" w:eastAsia="微软雅黑" w:cs="微软雅黑"/>
+          <w:b w:val="0"/>
+          <w:sz w:val="21"/>
+        </w:rPr>
+        <w:t xml:space="preserve"> 同款结论：</w:t>
+      </w:r>
+      <w:r>
+        <w:rPr>
+          <w:rFonts w:ascii="微软雅黑" w:hAnsi="微软雅黑" w:eastAsia="微软雅黑" w:cs="微软雅黑"/>
+          <w:b/>
+          <w:sz w:val="21"/>
+        </w:rPr>
+        <w:t>CDN 只认路径，签名纯粹卡在"谁给你这条路径"这一层</w:t>
+      </w:r>
+      <w:r>
+        <w:rPr>
+          <w:rFonts w:ascii="微软雅黑" w:hAnsi="微软雅黑" w:eastAsia="微软雅黑" w:cs="微软雅黑"/>
+          <w:b w:val="0"/>
+          <w:sz w:val="21"/>
+        </w:rPr>
+        <w:t>。</w:t>
+      </w:r>
+    </w:p>
+    <w:p>
+      <w:pPr>
+        <w:spacing w:after="120" w:line="312" w:lineRule="auto"/>
+      </w:pPr>
+      <w:r>
+        <w:rPr>
+          <w:rFonts w:ascii="微软雅黑" w:hAnsi="微软雅黑" w:eastAsia="微软雅黑" w:cs="微软雅黑"/>
+          <w:b/>
+          <w:sz w:val="21"/>
+        </w:rPr>
+        <w:t>② 那条路径不是"listenXxx"接口给的</w:t>
+      </w:r>
+    </w:p>
+    <w:p>
+      <w:pPr>
+        <w:spacing w:after="120" w:line="312" w:lineRule="auto"/>
+      </w:pPr>
+      <w:r>
+        <w:rPr>
+          <w:rFonts w:ascii="微软雅黑" w:hAnsi="微软雅黑" w:eastAsia="微软雅黑" w:cs="微软雅黑"/>
+          <w:b w:val="0"/>
+          <w:sz w:val="21"/>
+        </w:rPr>
+        <w:t xml:space="preserve">在 </w:t>
+      </w:r>
+      <w:r>
+        <w:rPr>
+          <w:rFonts w:ascii="Consolas" w:hAnsi="Consolas" w:eastAsia="Consolas" w:cs="Consolas"/>
+          <w:b w:val="0"/>
+          <w:color w:val="B03030"/>
+          <w:sz w:val="19"/>
+        </w:rPr>
+        <w:t>y.migu.cn/app/v4/zt/2022/music/index.html?id=&lt;resourceId&gt;</w:t>
+      </w:r>
+      <w:r>
+        <w:rPr>
+          <w:rFonts w:ascii="微软雅黑" w:hAnsi="微软雅黑" w:eastAsia="微软雅黑" w:cs="微软雅黑"/>
+          <w:b w:val="0"/>
+          <w:sz w:val="21"/>
+        </w:rPr>
+        <w:t xml:space="preserve"> 页面上，按 Fetch/XHR 过滤后</w:t>
+      </w:r>
+      <w:r>
+        <w:rPr>
+          <w:rFonts w:ascii="微软雅黑" w:hAnsi="微软雅黑" w:eastAsia="微软雅黑" w:cs="微软雅黑"/>
+          <w:b/>
+          <w:sz w:val="21"/>
+        </w:rPr>
+        <w:t>没有任何名字含 listen 的请求</w:t>
+      </w:r>
+      <w:r>
+        <w:rPr>
+          <w:rFonts w:ascii="微软雅黑" w:hAnsi="微软雅黑" w:eastAsia="微软雅黑" w:cs="微软雅黑"/>
+          <w:b w:val="0"/>
+          <w:sz w:val="21"/>
+        </w:rPr>
+        <w:t>，</w:t>
+      </w:r>
+    </w:p>
+    <w:p>
+      <w:pPr>
+        <w:spacing w:after="120" w:line="312" w:lineRule="auto"/>
+      </w:pPr>
+      <w:r>
+        <w:rPr>
+          <w:rFonts w:ascii="微软雅黑" w:hAnsi="微软雅黑" w:eastAsia="微软雅黑" w:cs="微软雅黑"/>
+          <w:b w:val="0"/>
+          <w:sz w:val="21"/>
+        </w:rPr>
+        <w:t>只有：</w:t>
+      </w:r>
+      <w:r>
+        <w:rPr>
+          <w:rFonts w:ascii="Consolas" w:hAnsi="Consolas" w:eastAsia="Consolas" w:cs="Consolas"/>
+          <w:b w:val="0"/>
+          <w:color w:val="B03030"/>
+          <w:sz w:val="19"/>
+        </w:rPr>
+        <w:t>h5binToKafka</w:t>
+      </w:r>
+      <w:r>
+        <w:rPr>
+          <w:rFonts w:ascii="微软雅黑" w:hAnsi="微软雅黑" w:eastAsia="微软雅黑" w:cs="微软雅黑"/>
+          <w:b w:val="0"/>
+          <w:sz w:val="21"/>
+        </w:rPr>
+        <w:t>(fetch)、</w:t>
+      </w:r>
+      <w:r>
+        <w:rPr>
+          <w:rFonts w:ascii="Consolas" w:hAnsi="Consolas" w:eastAsia="Consolas" w:cs="Consolas"/>
+          <w:b w:val="0"/>
+          <w:color w:val="B03030"/>
+          <w:sz w:val="19"/>
+        </w:rPr>
+        <w:t>webData.html</w:t>
+      </w:r>
+      <w:r>
+        <w:rPr>
+          <w:rFonts w:ascii="微软雅黑" w:hAnsi="微软雅黑" w:eastAsia="微软雅黑" w:cs="微软雅黑"/>
+          <w:b w:val="0"/>
+          <w:sz w:val="21"/>
+        </w:rPr>
+        <w:t>×3(331 B)、</w:t>
+      </w:r>
+      <w:r>
+        <w:rPr>
+          <w:rFonts w:ascii="微软雅黑" w:hAnsi="微软雅黑" w:eastAsia="微软雅黑" w:cs="微软雅黑"/>
+          <w:b/>
+          <w:sz w:val="21"/>
+        </w:rPr>
+        <w:t>`pageaccess.do`(1.0 kB)</w:t>
+      </w:r>
+      <w:r>
+        <w:rPr>
+          <w:rFonts w:ascii="微软雅黑" w:hAnsi="微软雅黑" w:eastAsia="微软雅黑" w:cs="微软雅黑"/>
+          <w:b w:val="0"/>
+          <w:sz w:val="21"/>
+        </w:rPr>
+        <w:t>。</w:t>
+      </w:r>
+    </w:p>
+    <w:p>
+      <w:pPr>
+        <w:spacing w:after="120" w:line="312" w:lineRule="auto"/>
+      </w:pPr>
+      <w:r>
+        <w:rPr>
+          <w:rFonts w:ascii="微软雅黑" w:hAnsi="微软雅黑" w:eastAsia="微软雅黑" w:cs="微软雅黑"/>
+          <w:b w:val="0"/>
+          <w:sz w:val="21"/>
+        </w:rPr>
+        <w:t xml:space="preserve">页面本身是 3448 字节的引导器（只引 </w:t>
+      </w:r>
+      <w:r>
+        <w:rPr>
+          <w:rFonts w:ascii="Consolas" w:hAnsi="Consolas" w:eastAsia="Consolas" w:cs="Consolas"/>
+          <w:b w:val="0"/>
+          <w:color w:val="B03030"/>
+          <w:sz w:val="19"/>
+        </w:rPr>
+        <w:t>migukit-booter.min.js</w:t>
+      </w:r>
+      <w:r>
+        <w:rPr>
+          <w:rFonts w:ascii="微软雅黑" w:hAnsi="微软雅黑" w:eastAsia="微软雅黑" w:cs="微软雅黑"/>
+          <w:b w:val="0"/>
+          <w:sz w:val="21"/>
+        </w:rPr>
+        <w:t xml:space="preserve">），HTML 里也不含 </w:t>
+      </w:r>
+      <w:r>
+        <w:rPr>
+          <w:rFonts w:ascii="Consolas" w:hAnsi="Consolas" w:eastAsia="Consolas" w:cs="Consolas"/>
+          <w:b w:val="0"/>
+          <w:color w:val="B03030"/>
+          <w:sz w:val="19"/>
+        </w:rPr>
+        <w:t>.mp3</w:t>
+      </w:r>
+      <w:r>
+        <w:rPr>
+          <w:rFonts w:ascii="微软雅黑" w:hAnsi="微软雅黑" w:eastAsia="微软雅黑" w:cs="微软雅黑"/>
+          <w:b w:val="0"/>
+          <w:sz w:val="21"/>
+        </w:rPr>
+        <w:t xml:space="preserve"> 路径。</w:t>
+      </w:r>
+    </w:p>
+    <w:p>
+      <w:pPr>
+        <w:spacing w:after="120" w:line="312" w:lineRule="auto"/>
+      </w:pPr>
+      <w:r>
+        <w:rPr>
+          <w:rFonts w:ascii="微软雅黑" w:hAnsi="微软雅黑" w:eastAsia="微软雅黑" w:cs="微软雅黑"/>
+          <w:b/>
+          <w:sz w:val="21"/>
+        </w:rPr>
+        <w:t>③ 下一步（只差一次点击）</w:t>
+      </w:r>
+    </w:p>
+    <w:p>
+      <w:pPr>
+        <w:spacing w:after="120" w:line="312" w:lineRule="auto"/>
+      </w:pPr>
+      <w:r>
+        <w:rPr>
+          <w:rFonts w:ascii="Consolas" w:hAnsi="Consolas" w:eastAsia="Consolas" w:cs="Consolas"/>
+          <w:b w:val="0"/>
+          <w:color w:val="B03030"/>
+          <w:sz w:val="19"/>
+        </w:rPr>
+        <w:t>sdk.pageaccess.do</w:t>
+      </w:r>
+      <w:r>
+        <w:rPr>
+          <w:rFonts w:ascii="微软雅黑" w:hAnsi="微软雅黑" w:eastAsia="微软雅黑" w:cs="微软雅黑"/>
+          <w:b w:val="0"/>
+          <w:sz w:val="21"/>
+        </w:rPr>
+        <w:t xml:space="preserve"> 是唯一体积足够携带该 URL 的响应 → 让用户点开它看 </w:t>
+      </w:r>
+      <w:r>
+        <w:rPr>
+          <w:rFonts w:ascii="微软雅黑" w:hAnsi="微软雅黑" w:eastAsia="微软雅黑" w:cs="微软雅黑"/>
+          <w:b/>
+          <w:sz w:val="21"/>
+        </w:rPr>
+        <w:t>响应</w:t>
+      </w:r>
+      <w:r>
+        <w:rPr>
+          <w:rFonts w:ascii="微软雅黑" w:hAnsi="微软雅黑" w:eastAsia="微软雅黑" w:cs="微软雅黑"/>
+          <w:b w:val="0"/>
+          <w:sz w:val="21"/>
+        </w:rPr>
+        <w:t xml:space="preserve"> 内容；</w:t>
+      </w:r>
+    </w:p>
+    <w:p>
+      <w:pPr>
+        <w:spacing w:after="120" w:line="312" w:lineRule="auto"/>
+      </w:pPr>
+      <w:r>
+        <w:rPr>
+          <w:rFonts w:ascii="微软雅黑" w:hAnsi="微软雅黑" w:eastAsia="微软雅黑" w:cs="微软雅黑"/>
+          <w:b w:val="0"/>
+          <w:sz w:val="21"/>
+        </w:rPr>
+        <w:t xml:space="preserve">若其中含 </w:t>
+      </w:r>
+      <w:r>
+        <w:rPr>
+          <w:rFonts w:ascii="Consolas" w:hAnsi="Consolas" w:eastAsia="Consolas" w:cs="Consolas"/>
+          <w:b w:val="0"/>
+          <w:color w:val="B03030"/>
+          <w:sz w:val="19"/>
+        </w:rPr>
+        <w:t>freetyst</w:t>
+      </w:r>
+      <w:r>
+        <w:rPr>
+          <w:rFonts w:ascii="微软雅黑" w:hAnsi="微软雅黑" w:eastAsia="微软雅黑" w:cs="微软雅黑"/>
+          <w:b w:val="0"/>
+          <w:sz w:val="21"/>
+        </w:rPr>
+        <w:t xml:space="preserve"> 路径，则链路为：</w:t>
+      </w:r>
+      <w:r>
+        <w:rPr>
+          <w:rFonts w:ascii="Consolas" w:hAnsi="Consolas" w:eastAsia="Consolas" w:cs="Consolas"/>
+          <w:b w:val="0"/>
+          <w:color w:val="B03030"/>
+          <w:sz w:val="19"/>
+        </w:rPr>
+        <w:t>search_all.do 取 resourceId → pageaccess.do 取路径 → 去掉参数直接下载</w:t>
+      </w:r>
+      <w:r>
+        <w:rPr>
+          <w:rFonts w:ascii="微软雅黑" w:hAnsi="微软雅黑" w:eastAsia="微软雅黑" w:cs="微软雅黑"/>
+          <w:b w:val="0"/>
+          <w:sz w:val="21"/>
+        </w:rPr>
+        <w:t>，</w:t>
+      </w:r>
+    </w:p>
+    <w:p>
+      <w:pPr>
+        <w:spacing w:after="120" w:line="312" w:lineRule="auto"/>
+      </w:pPr>
+      <w:r>
+        <w:rPr>
+          <w:rFonts w:ascii="微软雅黑" w:hAnsi="微软雅黑" w:eastAsia="微软雅黑" w:cs="微软雅黑"/>
+          <w:b/>
+          <w:sz w:val="21"/>
+        </w:rPr>
+        <w:t>全程无需签名</w:t>
+      </w:r>
+      <w:r>
+        <w:rPr>
+          <w:rFonts w:ascii="微软雅黑" w:hAnsi="微软雅黑" w:eastAsia="微软雅黑" w:cs="微软雅黑"/>
+          <w:b w:val="0"/>
+          <w:sz w:val="21"/>
+        </w:rPr>
+        <w:t>，可直接按"能交付才内置"加入清单。</w:t>
+      </w:r>
+    </w:p>
+    <w:p>
+      <w:pPr>
+        <w:spacing w:after="80" w:line="312" w:lineRule="auto"/>
+      </w:pPr>
+      <w:r>
+        <w:rPr>
+          <w:rFonts w:ascii="黑体" w:hAnsi="黑体" w:eastAsia="黑体" w:cs="黑体"/>
+          <w:b/>
+          <w:sz w:val="24"/>
+        </w:rPr>
+        <w:t>D.3 咪咕播放侧：全链路打通并内置（2026-10-18 收尾实测）</w:t>
+      </w:r>
+    </w:p>
+    <w:p>
+      <w:pPr>
+        <w:spacing w:after="120" w:line="312" w:lineRule="auto"/>
+        <w:ind w:left="280"/>
+      </w:pPr>
+      <w:r>
+        <w:rPr>
+          <w:rFonts w:ascii="微软雅黑" w:hAnsi="微软雅黑" w:eastAsia="微软雅黑" w:cs="微软雅黑"/>
+          <w:b w:val="0"/>
+          <w:color w:val="555555"/>
+          <w:sz w:val="19"/>
+        </w:rPr>
+        <w:t>D.2 里“只差一次点击（pageaccess.do）”的路径不再需要 —— 已用一条更干净的免登录路线打通，</w:t>
+      </w:r>
+    </w:p>
+    <w:p>
+      <w:pPr>
+        <w:spacing w:after="120" w:line="312" w:lineRule="auto"/>
+        <w:ind w:left="280"/>
+      </w:pPr>
+      <w:r>
+        <w:rPr>
+          <w:rFonts w:ascii="微软雅黑" w:hAnsi="微软雅黑" w:eastAsia="微软雅黑" w:cs="微软雅黑"/>
+          <w:b w:val="0"/>
+          <w:color w:val="555555"/>
+          <w:sz w:val="19"/>
+        </w:rPr>
+        <w:t xml:space="preserve">并实测通过“检索 → 取链 → 下载 → 双校验”全链路，正式内置为 </w:t>
+      </w:r>
+      <w:r>
+        <w:rPr>
+          <w:rFonts w:ascii="Consolas" w:hAnsi="Consolas" w:eastAsia="Consolas" w:cs="Consolas"/>
+          <w:b w:val="0"/>
+          <w:color w:val="B03030"/>
+          <w:sz w:val="17"/>
+        </w:rPr>
+        <w:t>mmusic/search/migu.py</w:t>
+      </w:r>
+      <w:r>
+        <w:rPr>
+          <w:rFonts w:ascii="微软雅黑" w:hAnsi="微软雅黑" w:eastAsia="微软雅黑" w:cs="微软雅黑"/>
+          <w:b w:val="0"/>
+          <w:color w:val="555555"/>
+          <w:sz w:val="19"/>
+        </w:rPr>
+        <w:t>。</w:t>
+      </w:r>
+    </w:p>
+    <w:p>
+      <w:pPr>
+        <w:spacing w:after="120" w:line="312" w:lineRule="auto"/>
+      </w:pPr>
+      <w:r>
+        <w:rPr>
+          <w:rFonts w:ascii="微软雅黑" w:hAnsi="微软雅黑" w:eastAsia="微软雅黑" w:cs="微软雅黑"/>
+          <w:b/>
+          <w:sz w:val="21"/>
+        </w:rPr>
+        <w:t>关键事实（全部实测过）</w:t>
+      </w:r>
+    </w:p>
+    <w:p>
+      <w:pPr>
+        <w:spacing w:after="40" w:line="312" w:lineRule="auto"/>
+        <w:ind w:left="320"/>
+      </w:pPr>
+      <w:r>
+        <w:rPr>
+          <w:rFonts w:ascii="微软雅黑" w:hAnsi="微软雅黑" w:eastAsia="微软雅黑" w:cs="微软雅黑"/>
+          <w:b w:val="0"/>
+          <w:sz w:val="21"/>
+        </w:rPr>
+        <w:t xml:space="preserve">1. 旧 SDK 路径 </w:t>
+      </w:r>
+      <w:r>
+        <w:rPr>
+          <w:rFonts w:ascii="Consolas" w:hAnsi="Consolas" w:eastAsia="Consolas" w:cs="Consolas"/>
+          <w:b w:val="0"/>
+          <w:color w:val="B03030"/>
+          <w:sz w:val="19"/>
+        </w:rPr>
+        <w:t>/app/providers/api/v2/song.listen.ask</w:t>
+      </w:r>
+      <w:r>
+        <w:rPr>
+          <w:rFonts w:ascii="微软雅黑" w:hAnsi="微软雅黑" w:eastAsia="微软雅黑" w:cs="微软雅黑"/>
+          <w:b w:val="0"/>
+          <w:sz w:val="21"/>
+        </w:rPr>
+        <w:t>（</w:t>
+      </w:r>
+      <w:r>
+        <w:rPr>
+          <w:rFonts w:ascii="Consolas" w:hAnsi="Consolas" w:eastAsia="Consolas" w:cs="Consolas"/>
+          <w:b w:val="0"/>
+          <w:color w:val="B03030"/>
+          <w:sz w:val="19"/>
+        </w:rPr>
+        <w:t>h5.nf.migu.cn</w:t>
+      </w:r>
+      <w:r>
+        <w:rPr>
+          <w:rFonts w:ascii="微软雅黑" w:hAnsi="微软雅黑" w:eastAsia="微软雅黑" w:cs="微软雅黑"/>
+          <w:b w:val="0"/>
+          <w:sz w:val="21"/>
+        </w:rPr>
+        <w:t xml:space="preserve"> / </w:t>
+      </w:r>
+      <w:r>
+        <w:rPr>
+          <w:rFonts w:ascii="Consolas" w:hAnsi="Consolas" w:eastAsia="Consolas" w:cs="Consolas"/>
+          <w:b w:val="0"/>
+          <w:color w:val="B03030"/>
+          <w:sz w:val="19"/>
+        </w:rPr>
+        <w:t>a.mm.migu.cn</w:t>
+      </w:r>
+      <w:r>
+        <w:rPr>
+          <w:rFonts w:ascii="微软雅黑" w:hAnsi="微软雅黑" w:eastAsia="微软雅黑" w:cs="微软雅黑"/>
+          <w:b w:val="0"/>
+          <w:sz w:val="21"/>
+        </w:rPr>
+        <w:t>）</w:t>
+      </w:r>
+      <w:r>
+        <w:rPr>
+          <w:rFonts w:ascii="微软雅黑" w:hAnsi="微软雅黑" w:eastAsia="微软雅黑" w:cs="微软雅黑"/>
+          <w:b/>
+          <w:sz w:val="21"/>
+        </w:rPr>
+        <w:t>均已 404</w:t>
+      </w:r>
+      <w:r>
+        <w:rPr>
+          <w:rFonts w:ascii="微软雅黑" w:hAnsi="微软雅黑" w:eastAsia="微软雅黑" w:cs="微软雅黑"/>
+          <w:b w:val="0"/>
+          <w:sz w:val="21"/>
+        </w:rPr>
+        <w:t>，</w:t>
+      </w:r>
+    </w:p>
+    <w:p>
+      <w:pPr>
+        <w:spacing w:after="120" w:line="312" w:lineRule="auto"/>
+      </w:pPr>
+      <w:r>
+        <w:rPr>
+          <w:rFonts w:ascii="微软雅黑" w:hAnsi="微软雅黑" w:eastAsia="微软雅黑" w:cs="微软雅黑"/>
+          <w:b w:val="0"/>
+          <w:sz w:val="21"/>
+        </w:rPr>
+        <w:t xml:space="preserve">   </w:t>
+      </w:r>
+      <w:r>
+        <w:rPr>
+          <w:rFonts w:ascii="Consolas" w:hAnsi="Consolas" w:eastAsia="Consolas" w:cs="Consolas"/>
+          <w:b w:val="0"/>
+          <w:color w:val="B03030"/>
+          <w:sz w:val="19"/>
+        </w:rPr>
+        <w:t>migu-sdk.min.js</w:t>
+      </w:r>
+      <w:r>
+        <w:rPr>
+          <w:rFonts w:ascii="微软雅黑" w:hAnsi="微软雅黑" w:eastAsia="微软雅黑" w:cs="微软雅黑"/>
+          <w:b w:val="0"/>
+          <w:sz w:val="21"/>
+        </w:rPr>
+        <w:t xml:space="preserve"> 里它已是死路径；现行 SDK </w:t>
+      </w:r>
+      <w:r>
+        <w:rPr>
+          <w:rFonts w:ascii="Consolas" w:hAnsi="Consolas" w:eastAsia="Consolas" w:cs="Consolas"/>
+          <w:b w:val="0"/>
+          <w:color w:val="B03030"/>
+          <w:sz w:val="19"/>
+        </w:rPr>
+        <w:t>getSongMedia</w:t>
+      </w:r>
+      <w:r>
+        <w:rPr>
+          <w:rFonts w:ascii="微软雅黑" w:hAnsi="微软雅黑" w:eastAsia="微软雅黑" w:cs="微软雅黑"/>
+          <w:b w:val="0"/>
+          <w:sz w:val="21"/>
+        </w:rPr>
+        <w:t xml:space="preserve"> 走</w:t>
+      </w:r>
+    </w:p>
+    <w:p>
+      <w:pPr>
+        <w:spacing w:after="120" w:line="312" w:lineRule="auto"/>
+      </w:pPr>
+      <w:r>
+        <w:rPr>
+          <w:rFonts w:ascii="微软雅黑" w:hAnsi="微软雅黑" w:eastAsia="微软雅黑" w:cs="微软雅黑"/>
+          <w:b w:val="0"/>
+          <w:sz w:val="21"/>
+        </w:rPr>
+        <w:t xml:space="preserve">   </w:t>
+      </w:r>
+      <w:r>
+        <w:rPr>
+          <w:rFonts w:ascii="Consolas" w:hAnsi="Consolas" w:eastAsia="Consolas" w:cs="Consolas"/>
+          <w:b w:val="0"/>
+          <w:color w:val="B03030"/>
+          <w:sz w:val="19"/>
+        </w:rPr>
+        <w:t>/strategy/listen-url/h5/v2.4</w:t>
+      </w:r>
+      <w:r>
+        <w:rPr>
+          <w:rFonts w:ascii="微软雅黑" w:hAnsi="微软雅黑" w:eastAsia="微软雅黑" w:cs="微软雅黑"/>
+          <w:b w:val="0"/>
+          <w:sz w:val="21"/>
+        </w:rPr>
+        <w:t>（响应 HEX 密文，未采用）。</w:t>
+      </w:r>
+    </w:p>
+    <w:p>
+      <w:pPr>
+        <w:spacing w:after="40" w:line="312" w:lineRule="auto"/>
+        <w:ind w:left="320"/>
+      </w:pPr>
+      <w:r>
+        <w:rPr>
+          <w:rFonts w:ascii="微软雅黑" w:hAnsi="微软雅黑" w:eastAsia="微软雅黑" w:cs="微软雅黑"/>
+          <w:b w:val="0"/>
+          <w:sz w:val="21"/>
+        </w:rPr>
+        <w:t xml:space="preserve">2. </w:t>
+      </w:r>
+      <w:r>
+        <w:rPr>
+          <w:rFonts w:ascii="微软雅黑" w:hAnsi="微软雅黑" w:eastAsia="微软雅黑" w:cs="微软雅黑"/>
+          <w:b/>
+          <w:sz w:val="21"/>
+        </w:rPr>
+        <w:t>可用路线</w:t>
+      </w:r>
+      <w:r>
+        <w:rPr>
+          <w:rFonts w:ascii="微软雅黑" w:hAnsi="微软雅黑" w:eastAsia="微软雅黑" w:cs="微软雅黑"/>
+          <w:b w:val="0"/>
+          <w:sz w:val="21"/>
+        </w:rPr>
+        <w:t>：</w:t>
+      </w:r>
+      <w:r>
+        <w:rPr>
+          <w:rFonts w:ascii="Consolas" w:hAnsi="Consolas" w:eastAsia="Consolas" w:cs="Consolas"/>
+          <w:b w:val="0"/>
+          <w:color w:val="B03030"/>
+          <w:sz w:val="19"/>
+        </w:rPr>
+        <w:t>content/listen-url</w:t>
+      </w:r>
+      <w:r>
+        <w:rPr>
+          <w:rFonts w:ascii="微软雅黑" w:hAnsi="微软雅黑" w:eastAsia="微软雅黑" w:cs="微软雅黑"/>
+          <w:b w:val="0"/>
+          <w:sz w:val="21"/>
+        </w:rPr>
+        <w:t>（</w:t>
+      </w:r>
+      <w:r>
+        <w:rPr>
+          <w:rFonts w:ascii="Consolas" w:hAnsi="Consolas" w:eastAsia="Consolas" w:cs="Consolas"/>
+          <w:b w:val="0"/>
+          <w:color w:val="B03030"/>
+          <w:sz w:val="19"/>
+        </w:rPr>
+        <w:t>MIGUM2.0/v2.0</w:t>
+      </w:r>
+      <w:r>
+        <w:rPr>
+          <w:rFonts w:ascii="微软雅黑" w:hAnsi="微软雅黑" w:eastAsia="微软雅黑" w:cs="微软雅黑"/>
+          <w:b w:val="0"/>
+          <w:sz w:val="21"/>
+        </w:rPr>
+        <w:t>），关键坑：</w:t>
+      </w:r>
+    </w:p>
+    <w:p>
+      <w:pPr>
+        <w:spacing w:after="120" w:line="312" w:lineRule="auto"/>
+      </w:pPr>
+      <w:r>
+        <w:rPr>
+          <w:rFonts w:ascii="微软雅黑" w:hAnsi="微软雅黑" w:eastAsia="微软雅黑" w:cs="微软雅黑"/>
+          <w:b w:val="0"/>
+          <w:sz w:val="21"/>
+        </w:rPr>
+        <w:t xml:space="preserve">   </w:t>
+      </w:r>
+      <w:r>
+        <w:rPr>
+          <w:rFonts w:ascii="微软雅黑" w:hAnsi="微软雅黑" w:eastAsia="微软雅黑" w:cs="微软雅黑"/>
+          <w:b/>
+          <w:sz w:val="21"/>
+        </w:rPr>
+        <w:t>`channel` 必须放在请求头里</w:t>
+      </w:r>
+      <w:r>
+        <w:rPr>
+          <w:rFonts w:ascii="微软雅黑" w:hAnsi="微软雅黑" w:eastAsia="微软雅黑" w:cs="微软雅黑"/>
+          <w:b w:val="0"/>
+          <w:sz w:val="21"/>
+        </w:rPr>
+        <w:t xml:space="preserve">——放查询参数只会得到 </w:t>
+      </w:r>
+      <w:r>
+        <w:rPr>
+          <w:rFonts w:ascii="Consolas" w:hAnsi="Consolas" w:eastAsia="Consolas" w:cs="Consolas"/>
+          <w:b w:val="0"/>
+          <w:color w:val="B03030"/>
+          <w:sz w:val="19"/>
+        </w:rPr>
+        <w:t>299999 channel不能为空</w:t>
+      </w:r>
+      <w:r>
+        <w:rPr>
+          <w:rFonts w:ascii="微软雅黑" w:hAnsi="微软雅黑" w:eastAsia="微软雅黑" w:cs="微软雅黑"/>
+          <w:b w:val="0"/>
+          <w:sz w:val="21"/>
+        </w:rPr>
+        <w:t>；</w:t>
+      </w:r>
+    </w:p>
+    <w:p>
+      <w:pPr>
+        <w:spacing w:after="120" w:line="312" w:lineRule="auto"/>
+      </w:pPr>
+      <w:r>
+        <w:rPr>
+          <w:rFonts w:ascii="微软雅黑" w:hAnsi="微软雅黑" w:eastAsia="微软雅黑" w:cs="微软雅黑"/>
+          <w:b w:val="0"/>
+          <w:sz w:val="21"/>
+        </w:rPr>
+        <w:t xml:space="preserve">   请求头给任意值（内置用 SDK 默认 </w:t>
+      </w:r>
+      <w:r>
+        <w:rPr>
+          <w:rFonts w:ascii="Consolas" w:hAnsi="Consolas" w:eastAsia="Consolas" w:cs="Consolas"/>
+          <w:b w:val="0"/>
+          <w:color w:val="B03030"/>
+          <w:sz w:val="19"/>
+        </w:rPr>
+        <w:t>014021I</w:t>
+      </w:r>
+      <w:r>
+        <w:rPr>
+          <w:rFonts w:ascii="微软雅黑" w:hAnsi="微软雅黑" w:eastAsia="微软雅黑" w:cs="微软雅黑"/>
+          <w:b w:val="0"/>
+          <w:sz w:val="21"/>
+        </w:rPr>
+        <w:t xml:space="preserve">）即 </w:t>
+      </w:r>
+      <w:r>
+        <w:rPr>
+          <w:rFonts w:ascii="Consolas" w:hAnsi="Consolas" w:eastAsia="Consolas" w:cs="Consolas"/>
+          <w:b w:val="0"/>
+          <w:color w:val="B03030"/>
+          <w:sz w:val="19"/>
+        </w:rPr>
+        <w:t>000000 操作成功</w:t>
+      </w:r>
+      <w:r>
+        <w:rPr>
+          <w:rFonts w:ascii="微软雅黑" w:hAnsi="微软雅黑" w:eastAsia="微软雅黑" w:cs="微软雅黑"/>
+          <w:b w:val="0"/>
+          <w:sz w:val="21"/>
+        </w:rPr>
+        <w:t>。</w:t>
+      </w:r>
+    </w:p>
+    <w:p>
+      <w:pPr>
+        <w:spacing w:after="120" w:line="312" w:lineRule="auto"/>
+      </w:pPr>
+      <w:r>
+        <w:rPr>
+          <w:rFonts w:ascii="微软雅黑" w:hAnsi="微软雅黑" w:eastAsia="微软雅黑" w:cs="微软雅黑"/>
+          <w:b w:val="0"/>
+          <w:sz w:val="21"/>
+        </w:rPr>
+        <w:t xml:space="preserve">   参数：</w:t>
+      </w:r>
+      <w:r>
+        <w:rPr>
+          <w:rFonts w:ascii="Consolas" w:hAnsi="Consolas" w:eastAsia="Consolas" w:cs="Consolas"/>
+          <w:b w:val="0"/>
+          <w:color w:val="B03030"/>
+          <w:sz w:val="19"/>
+        </w:rPr>
+        <w:t>copyrightId / contentId / resourceType / netType=01 / toneFlag=PQ</w:t>
+      </w:r>
+      <w:r>
+        <w:rPr>
+          <w:rFonts w:ascii="微软雅黑" w:hAnsi="微软雅黑" w:eastAsia="微软雅黑" w:cs="微软雅黑"/>
+          <w:b w:val="0"/>
+          <w:sz w:val="21"/>
+        </w:rPr>
+        <w:t>；</w:t>
+      </w:r>
+    </w:p>
+    <w:p>
+      <w:pPr>
+        <w:spacing w:after="120" w:line="312" w:lineRule="auto"/>
+      </w:pPr>
+      <w:r>
+        <w:rPr>
+          <w:rFonts w:ascii="微软雅黑" w:hAnsi="微软雅黑" w:eastAsia="微软雅黑" w:cs="微软雅黑"/>
+          <w:b w:val="0"/>
+          <w:sz w:val="21"/>
+        </w:rPr>
+        <w:t xml:space="preserve">   返回 </w:t>
+      </w:r>
+      <w:r>
+        <w:rPr>
+          <w:rFonts w:ascii="Consolas" w:hAnsi="Consolas" w:eastAsia="Consolas" w:cs="Consolas"/>
+          <w:b w:val="0"/>
+          <w:color w:val="B03030"/>
+          <w:sz w:val="19"/>
+        </w:rPr>
+        <w:t>data.url</w:t>
+      </w:r>
+      <w:r>
+        <w:rPr>
+          <w:rFonts w:ascii="微软雅黑" w:hAnsi="微软雅黑" w:eastAsia="微软雅黑" w:cs="微软雅黑"/>
+          <w:b w:val="0"/>
+          <w:sz w:val="21"/>
+        </w:rPr>
+        <w:t xml:space="preserve"> 指向 </w:t>
+      </w:r>
+      <w:r>
+        <w:rPr>
+          <w:rFonts w:ascii="Consolas" w:hAnsi="Consolas" w:eastAsia="Consolas" w:cs="Consolas"/>
+          <w:b w:val="0"/>
+          <w:color w:val="B03030"/>
+          <w:sz w:val="19"/>
+        </w:rPr>
+        <w:t>freetyst.nf.migu.cn</w:t>
+      </w:r>
+      <w:r>
+        <w:rPr>
+          <w:rFonts w:ascii="微软雅黑" w:hAnsi="微软雅黑" w:eastAsia="微软雅黑" w:cs="微软雅黑"/>
+          <w:b w:val="0"/>
+          <w:sz w:val="21"/>
+        </w:rPr>
+        <w:t xml:space="preserve"> CDN。</w:t>
+      </w:r>
+    </w:p>
+    <w:p>
+      <w:pPr>
+        <w:spacing w:after="40" w:line="312" w:lineRule="auto"/>
+        <w:ind w:left="320"/>
+      </w:pPr>
+      <w:r>
+        <w:rPr>
+          <w:rFonts w:ascii="微软雅黑" w:hAnsi="微软雅黑" w:eastAsia="微软雅黑" w:cs="微软雅黑"/>
+          <w:b w:val="0"/>
+          <w:sz w:val="21"/>
+        </w:rPr>
+        <w:t xml:space="preserve">3. 免费侧只有 </w:t>
+      </w:r>
+      <w:r>
+        <w:rPr>
+          <w:rFonts w:ascii="微软雅黑" w:hAnsi="微软雅黑" w:eastAsia="微软雅黑" w:cs="微软雅黑"/>
+          <w:b/>
+          <w:sz w:val="21"/>
+        </w:rPr>
+        <w:t>PQ（128k mp3）</w:t>
+      </w:r>
+      <w:r>
+        <w:rPr>
+          <w:rFonts w:ascii="微软雅黑" w:hAnsi="微软雅黑" w:eastAsia="微软雅黑" w:cs="微软雅黑"/>
+          <w:b w:val="0"/>
+          <w:sz w:val="21"/>
+        </w:rPr>
+        <w:t>；</w:t>
+      </w:r>
+      <w:r>
+        <w:rPr>
+          <w:rFonts w:ascii="Consolas" w:hAnsi="Consolas" w:eastAsia="Consolas" w:cs="Consolas"/>
+          <w:b w:val="0"/>
+          <w:color w:val="B03030"/>
+          <w:sz w:val="19"/>
+        </w:rPr>
+        <w:t>toneFlag=HQ/SQ</w:t>
+      </w:r>
+      <w:r>
+        <w:rPr>
+          <w:rFonts w:ascii="微软雅黑" w:hAnsi="微软雅黑" w:eastAsia="微软雅黑" w:cs="微软雅黑"/>
+          <w:b w:val="0"/>
+          <w:sz w:val="21"/>
+        </w:rPr>
+        <w:t xml:space="preserve"> 多数曲目返回</w:t>
+      </w:r>
+    </w:p>
+    <w:p>
+      <w:pPr>
+        <w:spacing w:after="120" w:line="312" w:lineRule="auto"/>
+      </w:pPr>
+      <w:r>
+        <w:rPr>
+          <w:rFonts w:ascii="微软雅黑" w:hAnsi="微软雅黑" w:eastAsia="微软雅黑" w:cs="微软雅黑"/>
+          <w:b w:val="0"/>
+          <w:sz w:val="21"/>
+        </w:rPr>
+        <w:t xml:space="preserve">   </w:t>
+      </w:r>
+      <w:r>
+        <w:rPr>
+          <w:rFonts w:ascii="Consolas" w:hAnsi="Consolas" w:eastAsia="Consolas" w:cs="Consolas"/>
+          <w:b w:val="0"/>
+          <w:color w:val="B03030"/>
+          <w:sz w:val="19"/>
+        </w:rPr>
+        <w:t>cannotCode=440003 登录后免费试听</w:t>
+      </w:r>
+      <w:r>
+        <w:rPr>
+          <w:rFonts w:ascii="微软雅黑" w:hAnsi="微软雅黑" w:eastAsia="微软雅黑" w:cs="微软雅黑"/>
+          <w:b w:val="0"/>
+          <w:sz w:val="21"/>
+        </w:rPr>
+        <w:t xml:space="preserve"> —— 适配器</w:t>
+      </w:r>
+      <w:r>
+        <w:rPr>
+          <w:rFonts w:ascii="微软雅黑" w:hAnsi="微软雅黑" w:eastAsia="微软雅黑" w:cs="微软雅黑"/>
+          <w:b/>
+          <w:sz w:val="21"/>
+        </w:rPr>
+        <w:t>自动降级 PQ，不绕过登录</w:t>
+      </w:r>
+      <w:r>
+        <w:rPr>
+          <w:rFonts w:ascii="微软雅黑" w:hAnsi="微软雅黑" w:eastAsia="微软雅黑" w:cs="微软雅黑"/>
+          <w:b w:val="0"/>
+          <w:sz w:val="21"/>
+        </w:rPr>
+        <w:t>。</w:t>
+      </w:r>
+    </w:p>
+    <w:p>
+      <w:pPr>
+        <w:spacing w:after="40" w:line="312" w:lineRule="auto"/>
+        <w:ind w:left="320"/>
+      </w:pPr>
+      <w:r>
+        <w:rPr>
+          <w:rFonts w:ascii="微软雅黑" w:hAnsi="微软雅黑" w:eastAsia="微软雅黑" w:cs="微软雅黑"/>
+          <w:b w:val="0"/>
+          <w:sz w:val="21"/>
+        </w:rPr>
+        <w:t>4. 完整度实测（仓库自带校验链）：</w:t>
+      </w:r>
+    </w:p>
+    <w:p>
+      <w:pPr>
+        <w:spacing w:after="40" w:line="312" w:lineRule="auto"/>
+        <w:ind w:left="320"/>
+      </w:pPr>
+      <w:r>
+        <w:rPr>
+          <w:rFonts w:ascii="微软雅黑" w:hAnsi="微软雅黑" w:eastAsia="微软雅黑" w:cs="微软雅黑"/>
+          <w:b w:val="0"/>
+          <w:sz w:val="21"/>
+        </w:rPr>
+        <w:t xml:space="preserve">• 《光年之外 邓紫棋》：下载 3769366 B（与接口 </w:t>
+      </w:r>
+      <w:r>
+        <w:rPr>
+          <w:rFonts w:ascii="Consolas" w:hAnsi="Consolas" w:eastAsia="Consolas" w:cs="Consolas"/>
+          <w:b w:val="0"/>
+          <w:color w:val="B03030"/>
+          <w:sz w:val="19"/>
+        </w:rPr>
+        <w:t>rateFormats</w:t>
+      </w:r>
+      <w:r>
+        <w:rPr>
+          <w:rFonts w:ascii="微软雅黑" w:hAnsi="微软雅黑" w:eastAsia="微软雅黑" w:cs="微软雅黑"/>
+          <w:b w:val="0"/>
+          <w:sz w:val="21"/>
+        </w:rPr>
+        <w:t xml:space="preserve"> 声明字节数</w:t>
+      </w:r>
+      <w:r>
+        <w:rPr>
+          <w:rFonts w:ascii="微软雅黑" w:hAnsi="微软雅黑" w:eastAsia="微软雅黑" w:cs="微软雅黑"/>
+          <w:b/>
+          <w:sz w:val="21"/>
+        </w:rPr>
+        <w:t>完全一致</w:t>
+      </w:r>
+      <w:r>
+        <w:rPr>
+          <w:rFonts w:ascii="微软雅黑" w:hAnsi="微软雅黑" w:eastAsia="微软雅黑" w:cs="微软雅黑"/>
+          <w:b w:val="0"/>
+          <w:sz w:val="21"/>
+        </w:rPr>
+        <w:t>），</w:t>
+      </w:r>
+    </w:p>
+    <w:p>
+      <w:pPr>
+        <w:spacing w:after="120" w:line="312" w:lineRule="auto"/>
+      </w:pPr>
+      <w:r>
+        <w:rPr>
+          <w:rFonts w:ascii="微软雅黑" w:hAnsi="微软雅黑" w:eastAsia="微软雅黑" w:cs="微软雅黑"/>
+          <w:b w:val="0"/>
+          <w:sz w:val="21"/>
+        </w:rPr>
+        <w:t xml:space="preserve">     探测时长 = 下载时长 = 3:56，</w:t>
+      </w:r>
+      <w:r>
+        <w:rPr>
+          <w:rFonts w:ascii="Consolas" w:hAnsi="Consolas" w:eastAsia="Consolas" w:cs="Consolas"/>
+          <w:b w:val="0"/>
+          <w:color w:val="B03030"/>
+          <w:sz w:val="19"/>
+        </w:rPr>
+        <w:t>validate</w:t>
+      </w:r>
+      <w:r>
+        <w:rPr>
+          <w:rFonts w:ascii="微软雅黑" w:hAnsi="微软雅黑" w:eastAsia="微软雅黑" w:cs="微软雅黑"/>
+          <w:b w:val="0"/>
+          <w:sz w:val="21"/>
+        </w:rPr>
+        <w:t xml:space="preserve"> 与完整度门禁全过；</w:t>
+      </w:r>
+    </w:p>
+    <w:p>
+      <w:pPr>
+        <w:spacing w:after="40" w:line="312" w:lineRule="auto"/>
+        <w:ind w:left="320"/>
+      </w:pPr>
+      <w:r>
+        <w:rPr>
+          <w:rFonts w:ascii="微软雅黑" w:hAnsi="微软雅黑" w:eastAsia="微软雅黑" w:cs="微软雅黑"/>
+          <w:b w:val="0"/>
+          <w:sz w:val="21"/>
+        </w:rPr>
+        <w:t>• 《晴天 周杰伦》：4317311 B / 4:30，同样全过。</w:t>
+      </w:r>
+    </w:p>
+    <w:p>
+      <w:pPr>
+        <w:spacing w:after="40" w:line="312" w:lineRule="auto"/>
+        <w:ind w:left="320"/>
+      </w:pPr>
+      <w:r>
+        <w:rPr>
+          <w:rFonts w:ascii="微软雅黑" w:hAnsi="微软雅黑" w:eastAsia="微软雅黑" w:cs="微软雅黑"/>
+          <w:b w:val="0"/>
+          <w:sz w:val="21"/>
+        </w:rPr>
+        <w:t xml:space="preserve">5. 检索 </w:t>
+      </w:r>
+      <w:r>
+        <w:rPr>
+          <w:rFonts w:ascii="Consolas" w:hAnsi="Consolas" w:eastAsia="Consolas" w:cs="Consolas"/>
+          <w:b w:val="0"/>
+          <w:color w:val="B03030"/>
+          <w:sz w:val="19"/>
+        </w:rPr>
+        <w:t>search_all.do</w:t>
+      </w:r>
+      <w:r>
+        <w:rPr>
+          <w:rFonts w:ascii="微软雅黑" w:hAnsi="微软雅黑" w:eastAsia="微软雅黑" w:cs="微软雅黑"/>
+          <w:b w:val="0"/>
+          <w:sz w:val="21"/>
+        </w:rPr>
+        <w:t xml:space="preserve"> 单页返回 20 条（</w:t>
+      </w:r>
+      <w:r>
+        <w:rPr>
+          <w:rFonts w:ascii="Consolas" w:hAnsi="Consolas" w:eastAsia="Consolas" w:cs="Consolas"/>
+          <w:b w:val="0"/>
+          <w:color w:val="B03030"/>
+          <w:sz w:val="19"/>
+        </w:rPr>
+        <w:t>pageSize</w:t>
+      </w:r>
+      <w:r>
+        <w:rPr>
+          <w:rFonts w:ascii="微软雅黑" w:hAnsi="微软雅黑" w:eastAsia="微软雅黑" w:cs="微软雅黑"/>
+          <w:b w:val="0"/>
+          <w:sz w:val="21"/>
+        </w:rPr>
+        <w:t xml:space="preserve"> 不敏感），字段够用：</w:t>
+      </w:r>
+    </w:p>
+    <w:p>
+      <w:pPr>
+        <w:spacing w:after="120" w:line="312" w:lineRule="auto"/>
+      </w:pPr>
+      <w:r>
+        <w:rPr>
+          <w:rFonts w:ascii="微软雅黑" w:hAnsi="微软雅黑" w:eastAsia="微软雅黑" w:cs="微软雅黑"/>
+          <w:b w:val="0"/>
+          <w:sz w:val="21"/>
+        </w:rPr>
+        <w:t xml:space="preserve">   </w:t>
+      </w:r>
+      <w:r>
+        <w:rPr>
+          <w:rFonts w:ascii="Consolas" w:hAnsi="Consolas" w:eastAsia="Consolas" w:cs="Consolas"/>
+          <w:b w:val="0"/>
+          <w:color w:val="B03030"/>
+          <w:sz w:val="19"/>
+        </w:rPr>
+        <w:t>contentId / copyrightId / resourceType / singers / albums / rateFormats</w:t>
+      </w:r>
+      <w:r>
+        <w:rPr>
+          <w:rFonts w:ascii="微软雅黑" w:hAnsi="微软雅黑" w:eastAsia="微软雅黑" w:cs="微软雅黑"/>
+          <w:b w:val="0"/>
+          <w:sz w:val="21"/>
+        </w:rPr>
+        <w:t>。</w:t>
+      </w:r>
+    </w:p>
+    <w:p>
+      <w:pPr>
+        <w:spacing w:after="120" w:line="312" w:lineRule="auto"/>
+      </w:pPr>
+      <w:r>
+        <w:rPr>
+          <w:rFonts w:ascii="微软雅黑" w:hAnsi="微软雅黑" w:eastAsia="微软雅黑" w:cs="微软雅黑"/>
+          <w:b/>
+          <w:sz w:val="21"/>
+        </w:rPr>
+        <w:t>边界与设计取舍</w:t>
+      </w:r>
+    </w:p>
+    <w:p>
+      <w:pPr>
+        <w:spacing w:after="40" w:line="312" w:lineRule="auto"/>
+        <w:ind w:left="320"/>
+      </w:pPr>
+      <w:r>
+        <w:rPr>
+          <w:rFonts w:ascii="微软雅黑" w:hAnsi="微软雅黑" w:eastAsia="微软雅黑" w:cs="微软雅黑"/>
+          <w:b w:val="0"/>
+          <w:sz w:val="21"/>
+        </w:rPr>
+        <w:t>• 检索接口不带时长 → 时长由流水线对直链做</w:t>
+      </w:r>
+      <w:r>
+        <w:rPr>
+          <w:rFonts w:ascii="微软雅黑" w:hAnsi="微软雅黑" w:eastAsia="微软雅黑" w:cs="微软雅黑"/>
+          <w:b/>
+          <w:sz w:val="21"/>
+        </w:rPr>
+        <w:t>头部探测</w:t>
+      </w:r>
+      <w:r>
+        <w:rPr>
+          <w:rFonts w:ascii="微软雅黑" w:hAnsi="微软雅黑" w:eastAsia="微软雅黑" w:cs="微软雅黑"/>
+          <w:b w:val="0"/>
+          <w:sz w:val="21"/>
+        </w:rPr>
+        <w:t>（既有机制，零新增用户操作），</w:t>
+      </w:r>
+    </w:p>
+    <w:p>
+      <w:pPr>
+        <w:spacing w:after="120" w:line="312" w:lineRule="auto"/>
+      </w:pPr>
+      <w:r>
+        <w:rPr>
+          <w:rFonts w:ascii="微软雅黑" w:hAnsi="微软雅黑" w:eastAsia="微软雅黑" w:cs="微软雅黑"/>
+          <w:b w:val="0"/>
+          <w:sz w:val="21"/>
+        </w:rPr>
+        <w:t xml:space="preserve">  咪咕因此天然参与“跨平台参考时长”互证；</w:t>
+      </w:r>
+    </w:p>
+    <w:p>
+      <w:pPr>
+        <w:spacing w:after="40" w:line="312" w:lineRule="auto"/>
+        <w:ind w:left="320"/>
+      </w:pPr>
+      <w:r>
+        <w:rPr>
+          <w:rFonts w:ascii="微软雅黑" w:hAnsi="微软雅黑" w:eastAsia="微软雅黑" w:cs="微软雅黑"/>
+          <w:b w:val="0"/>
+          <w:sz w:val="21"/>
+        </w:rPr>
+        <w:t>• CDN 直链不校验签名（D.2），但适配器仍</w:t>
+      </w:r>
+      <w:r>
+        <w:rPr>
+          <w:rFonts w:ascii="微软雅黑" w:hAnsi="微软雅黑" w:eastAsia="微软雅黑" w:cs="微软雅黑"/>
+          <w:b/>
+          <w:sz w:val="21"/>
+        </w:rPr>
+        <w:t>按接口返回原样使用</w:t>
+      </w:r>
+      <w:r>
+        <w:rPr>
+          <w:rFonts w:ascii="微软雅黑" w:hAnsi="微软雅黑" w:eastAsia="微软雅黑" w:cs="微软雅黑"/>
+          <w:b w:val="0"/>
+          <w:sz w:val="21"/>
+        </w:rPr>
+        <w:t>，不改写参数；</w:t>
+      </w:r>
+    </w:p>
+    <w:p>
+      <w:pPr>
+        <w:spacing w:after="40" w:line="312" w:lineRule="auto"/>
+        <w:ind w:left="320"/>
+      </w:pPr>
+      <w:r>
+        <w:rPr>
+          <w:rFonts w:ascii="微软雅黑" w:hAnsi="微软雅黑" w:eastAsia="微软雅黑" w:cs="微软雅黑"/>
+          <w:b w:val="0"/>
+          <w:sz w:val="21"/>
+        </w:rPr>
+        <w:t>• 音源顺序：</w:t>
+      </w:r>
+      <w:r>
+        <w:rPr>
+          <w:rFonts w:ascii="Consolas" w:hAnsi="Consolas" w:eastAsia="Consolas" w:cs="Consolas"/>
+          <w:b w:val="0"/>
+          <w:color w:val="B03030"/>
+          <w:sz w:val="19"/>
+        </w:rPr>
+        <w:t>local → kuwo → kugou → migu → aggregator → wikimedia → internet_archive</w:t>
+      </w:r>
+      <w:r>
+        <w:rPr>
+          <w:rFonts w:ascii="微软雅黑" w:hAnsi="微软雅黑" w:eastAsia="微软雅黑" w:cs="微软雅黑"/>
+          <w:b w:val="0"/>
+          <w:sz w:val="21"/>
+        </w:rPr>
+        <w:t>。</w:t>
       </w:r>
     </w:p>
     <w:sectPr>

</xml_diff>